<commit_message>
rewrite scripts to proper 10-min length (3,593 Hangul syllables)
각 슬라이드 대본을 전면 재작성. 한글 음절 기준 3,593자로
대학 발표 속도(350음절/분) 기준 약 10.3분 분량.
발표대본_김종민.docx 동기화.

Co-Authored-By: Claude Sonnet 4.6 <noreply@anthropic.com>
</commit_message>
<xml_diff>
--- a/발표대본_김종민.docx
+++ b/발표대본_김종민.docx
@@ -37,14 +37,14 @@
           <w:color w:val="94A3B8"/>
           <w:sz w:val="20"/>
         </w:rPr>
-        <w:t>※ 예상 발표 시간: 약 10분  (보통 속도 300자/분 기준)</w:t>
+        <w:t>※ 예상 발표 시간: 약 10분  (350음절/분 기준)</w:t>
       </w:r>
     </w:p>
     <w:p/>
     <w:p>
       <w:pPr>
         <w:pStyle w:val="Heading1"/>
-        <w:spacing w:before="320" w:after="80"/>
+        <w:spacing w:before="360" w:after="120"/>
       </w:pPr>
       <w:r>
         <w:rPr>
@@ -63,12 +63,12 @@
           <w:color w:val="1E293A"/>
           <w:sz w:val="22"/>
         </w:rPr>
-        <w:t>안녕하세요. 강원대학교 원주캠퍼스 간호학과 1학년 김종민입니다.</w:t>
+        <w:t>안녕하세요. 저는 강원대학교 원주캠퍼스 간호학과 1학년 김종민입니다.</w:t>
       </w:r>
     </w:p>
     <w:p>
       <w:pPr>
-        <w:spacing w:after="120"/>
+        <w:spacing w:after="160"/>
       </w:pPr>
     </w:p>
     <w:p>
@@ -80,12 +80,12 @@
           <w:color w:val="1E293A"/>
           <w:sz w:val="22"/>
         </w:rPr>
-        <w:t>오늘 발표 주제는 '나의 커리어 로드맵'입니다. 자기이해 검사 결과를 출발점으로 삼아, 4년간의 구체적인 실행 계획까지를 여러분 앞에 펼치겠습니다.</w:t>
+        <w:t>오늘 저는 '나의 커리어 로드맵 — 검사 결과에서 실행 계획까지'라는 주제로 발표를 진행하겠습니다.</w:t>
       </w:r>
     </w:p>
     <w:p>
       <w:pPr>
-        <w:spacing w:after="120"/>
+        <w:spacing w:after="160"/>
       </w:pPr>
     </w:p>
     <w:p>
@@ -97,12 +97,46 @@
           <w:color w:val="1E293A"/>
           <w:sz w:val="22"/>
         </w:rPr>
-        <w:t>저의 비전은 단 한 문장입니다.</w:t>
+        <w:t>이 발표를 준비하기 전, 저는 스스로에게 이런 질문을 던졌습니다. "나는 왜 간호학과에 왔는가?" 막연하게 '간호사가 되고 싶다'는 생각만으로 여기 서 있는 건 아닌지, 정말 내가 무엇을 원하는 사람인지를 먼저 확인하고 싶었습니다.</w:t>
       </w:r>
     </w:p>
     <w:p>
       <w:pPr>
-        <w:spacing w:after="120"/>
+        <w:spacing w:after="160"/>
+      </w:pPr>
+    </w:p>
+    <w:p>
+      <w:pPr>
+        <w:spacing w:after="80"/>
+      </w:pPr>
+      <w:r>
+        <w:rPr>
+          <w:color w:val="1E293A"/>
+          <w:sz w:val="22"/>
+        </w:rPr>
+        <w:t>그 답을 찾기 위해 자기이해 검사를 활용했고, 그 결과를 출발점으로 삼아 1학년의 목표부터 4년간의 로드맵, 그리고 졸업 후 5년의 비전까지를 이 발표에 담았습니다.</w:t>
+      </w:r>
+    </w:p>
+    <w:p>
+      <w:pPr>
+        <w:spacing w:after="160"/>
+      </w:pPr>
+    </w:p>
+    <w:p>
+      <w:pPr>
+        <w:spacing w:after="80"/>
+      </w:pPr>
+      <w:r>
+        <w:rPr>
+          <w:color w:val="1E293A"/>
+          <w:sz w:val="22"/>
+        </w:rPr>
+        <w:t>저의 비전은 딱 한 문장입니다.</w:t>
+      </w:r>
+    </w:p>
+    <w:p>
+      <w:pPr>
+        <w:spacing w:after="160"/>
       </w:pPr>
     </w:p>
     <w:p>
@@ -119,7 +153,7 @@
     </w:p>
     <w:p>
       <w:pPr>
-        <w:spacing w:after="120"/>
+        <w:spacing w:after="160"/>
       </w:pPr>
     </w:p>
     <w:p>
@@ -131,14 +165,14 @@
           <w:color w:val="1E293A"/>
           <w:sz w:val="22"/>
         </w:rPr>
-        <w:t>어떤 간호사가 될 것인지, 그러기 위해 지금 무엇을 할 것인지. 지금부터 시작하겠습니다.</w:t>
+        <w:t>단순히 간호사가 되겠다는 목표가 아닙니다. 어떤 간호사가 될 것인지, 어떻게 준비할 것인지를 오늘 이 자리에서 구체적으로 말씀드리겠습니다. 그럼 시작하겠습니다.</w:t>
       </w:r>
     </w:p>
     <w:p/>
     <w:p>
       <w:pPr>
         <w:pStyle w:val="Heading1"/>
-        <w:spacing w:before="320" w:after="80"/>
+        <w:spacing w:before="360" w:after="120"/>
       </w:pPr>
       <w:r>
         <w:rPr>
@@ -157,12 +191,12 @@
           <w:color w:val="1E293A"/>
           <w:sz w:val="22"/>
         </w:rPr>
-        <w:t>자기이해 검사 결과를 통해 저 자신에 대해 세 가지를 확인했습니다.</w:t>
+        <w:t>이 슬라이드는 자기이해 검사를 통해 제가 어떤 사람인지를 분석한 내용입니다.</w:t>
       </w:r>
     </w:p>
     <w:p>
       <w:pPr>
-        <w:spacing w:after="120"/>
+        <w:spacing w:after="160"/>
       </w:pPr>
     </w:p>
     <w:p>
@@ -174,13 +208,26 @@
           <w:color w:val="1E293A"/>
           <w:sz w:val="22"/>
         </w:rPr>
-        <w:t>첫째, 핵심 가치는 '사회적 기여'입니다. 개인적 성취보다 타인과 사회에 실질적으로 도움이 되는 일에서 보람을 느끼는 사람이라는 결과가 나왔습니다.</w:t>
+        <w:t>검사 결과에서 세 가지 핵심 사실을 확인했습니다.</w:t>
       </w:r>
     </w:p>
     <w:p>
       <w:pPr>
-        <w:spacing w:after="120"/>
-      </w:pPr>
+        <w:spacing w:after="160"/>
+      </w:pPr>
+    </w:p>
+    <w:p>
+      <w:pPr>
+        <w:spacing w:after="80" w:before="160"/>
+      </w:pPr>
+      <w:r>
+        <w:rPr>
+          <w:b/>
+          <w:color w:val="1E3A8A"/>
+          <w:sz w:val="22"/>
+        </w:rPr>
+        <w:t>첫째, 저의 핵심 가치는 '사회적 기여'입니다.</w:t>
+      </w:r>
     </w:p>
     <w:p>
       <w:pPr>
@@ -191,13 +238,26 @@
           <w:color w:val="1E293A"/>
           <w:sz w:val="22"/>
         </w:rPr>
-        <w:t>둘째, 대표 강점은 성실함과 책임감입니다. 맡은 일은 기준 이상으로 해내야 직성이 풀리는 성향입니다. 간호직이 요구하는 '환자에 대한 책임'과 정확히 맞닿아 있습니다.</w:t>
+        <w:t>저는 급여나 안정성보다 제가 하는 일이 타인과 사회에 실질적으로 도움이 될 때 훨씬 더 큰 보람을 느끼는 사람이라는 것이 검사에서 분명하게 드러났습니다. 이 결과를 보고 저는 사실 놀라지 않았습니다. 돌이켜보면, 중학교 때 처음 봉사활동을 나갔던 날의 뿌듯함이 아직도 기억에 남아 있거든요.</w:t>
       </w:r>
     </w:p>
     <w:p>
       <w:pPr>
-        <w:spacing w:after="120"/>
-      </w:pPr>
+        <w:spacing w:after="160"/>
+      </w:pPr>
+    </w:p>
+    <w:p>
+      <w:pPr>
+        <w:spacing w:after="80" w:before="160"/>
+      </w:pPr>
+      <w:r>
+        <w:rPr>
+          <w:b/>
+          <w:color w:val="1E3A8A"/>
+          <w:sz w:val="22"/>
+        </w:rPr>
+        <w:t>둘째, 저의 대표 강점은 성실함과 책임감입니다.</w:t>
+      </w:r>
     </w:p>
     <w:p>
       <w:pPr>
@@ -208,13 +268,26 @@
           <w:color w:val="1E293A"/>
           <w:sz w:val="22"/>
         </w:rPr>
-        <w:t>셋째, 임상 관심 분야는 응급실·수술실입니다. 빠른 판단과 즉각적인 행동이 필요한 환경에서 오히려 집중력이 올라가는 기질을 확인했습니다.</w:t>
+        <w:t>맡은 일은 반드시 끝까지 완수하고, 기준 이하의 결과물에는 타협하지 않는 성향이 뚜렷하게 나타났습니다. 간호직은 매 순간 환자의 안전에 직결된 책임을 져야 하는 직업입니다. 그 책임을 감당할 수 있는 성향이 제게 있다는 것을 이번 검사를 통해 다시 한번 확인했습니다.</w:t>
       </w:r>
     </w:p>
     <w:p>
       <w:pPr>
-        <w:spacing w:after="120"/>
-      </w:pPr>
+        <w:spacing w:after="160"/>
+      </w:pPr>
+    </w:p>
+    <w:p>
+      <w:pPr>
+        <w:spacing w:after="80" w:before="160"/>
+      </w:pPr>
+      <w:r>
+        <w:rPr>
+          <w:b/>
+          <w:color w:val="1E3A8A"/>
+          <w:sz w:val="22"/>
+        </w:rPr>
+        <w:t>셋째, 임상 관심 분야는 응급실과 수술실입니다.</w:t>
+      </w:r>
     </w:p>
     <w:p>
       <w:pPr>
@@ -225,14 +298,65 @@
           <w:color w:val="1E293A"/>
           <w:sz w:val="22"/>
         </w:rPr>
-        <w:t>이 세 가지가 하나의 문장으로 수렴됩니다. "나는 사회적 기여를 중요하게 여기고, 성실하고 책임감 있는 사람이며, 응급 간호 분야에 흥미가 있다." 이것이 제 진로 설계의 출발점입니다.</w:t>
+        <w:t>긴박하고 즉각적인 판단이 요구되는 환경에서 오히려 집중력이 올라가고 성취감을 느끼는 기질이 검사에서도 확인됐습니다. 평소에 느꼈던 것과 완전히 일치했습니다.</w:t>
+      </w:r>
+    </w:p>
+    <w:p>
+      <w:pPr>
+        <w:spacing w:after="160"/>
+      </w:pPr>
+    </w:p>
+    <w:p>
+      <w:pPr>
+        <w:spacing w:after="80"/>
+      </w:pPr>
+      <w:r>
+        <w:rPr>
+          <w:color w:val="1E293A"/>
+          <w:sz w:val="22"/>
+        </w:rPr>
+        <w:t>이 세 가지를 하나의 문장으로 연결하면 이렇게 됩니다.</w:t>
+      </w:r>
+    </w:p>
+    <w:p>
+      <w:pPr>
+        <w:spacing w:after="160"/>
+      </w:pPr>
+    </w:p>
+    <w:p>
+      <w:pPr>
+        <w:spacing w:after="80"/>
+      </w:pPr>
+      <w:r>
+        <w:rPr>
+          <w:color w:val="1E293A"/>
+          <w:sz w:val="22"/>
+        </w:rPr>
+        <w:t>"나는 사회적 기여를 중요하게 여기고, 성실함과 책임감을 가진 사람이며, 응급실·수술실 간호에 흥미가 있다."</w:t>
+      </w:r>
+    </w:p>
+    <w:p>
+      <w:pPr>
+        <w:spacing w:after="160"/>
+      </w:pPr>
+    </w:p>
+    <w:p>
+      <w:pPr>
+        <w:spacing w:after="80"/>
+      </w:pPr>
+      <w:r>
+        <w:rPr>
+          <w:color w:val="1E293A"/>
+          <w:sz w:val="22"/>
+        </w:rPr>
+        <w:t>이 문장이 오늘 발표 전체의 출발점이자 제 진로 설계의 근거입니다.</w:t>
       </w:r>
     </w:p>
     <w:p/>
     <w:p>
       <w:pPr>
         <w:pStyle w:val="Heading1"/>
-        <w:spacing w:before="320" w:after="80"/>
+        <w:spacing w:before="360" w:after="120"/>
       </w:pPr>
       <w:r>
         <w:rPr>
@@ -251,17 +375,17 @@
           <w:color w:val="1E293A"/>
           <w:sz w:val="22"/>
         </w:rPr>
-        <w:t>검사 결과를 기반으로 세 가지 진로 후보를 설정했습니다.</w:t>
+        <w:t>자기이해 검사 결과를 바탕으로 현실적으로 탐색 가능한 진로 후보 세 가지를 정리했습니다.</w:t>
       </w:r>
     </w:p>
     <w:p>
       <w:pPr>
-        <w:spacing w:after="120"/>
+        <w:spacing w:after="160"/>
       </w:pPr>
     </w:p>
     <w:p>
       <w:pPr>
-        <w:spacing w:after="80" w:before="120"/>
+        <w:spacing w:after="80" w:before="160"/>
       </w:pPr>
       <w:r>
         <w:rPr>
@@ -269,17 +393,29 @@
           <w:color w:val="1E3A8A"/>
           <w:sz w:val="22"/>
         </w:rPr>
-        <w:t>1순위, 응급실 간호사입니다. 환자의 생사가 결정되는 최전선에서 빠른 임상 성장을 경험할 수 있습니다. 책임감과 집중력이 요구되는 환경이 제 강점과 딱 맞습니다. 단, 고강도 교대 근무와 정신적 소진에 대한 준비가 필요합니다.</w:t>
+        <w:t>1순위, 응급실 간호사입니다.</w:t>
       </w:r>
     </w:p>
     <w:p>
       <w:pPr>
-        <w:spacing w:after="120"/>
-      </w:pPr>
+        <w:spacing w:after="80"/>
+      </w:pPr>
+      <w:r>
+        <w:rPr>
+          <w:color w:val="1E293A"/>
+          <w:sz w:val="22"/>
+        </w:rPr>
+        <w:t>응급실은 환자의 생사가 결정되는 최전선입니다. 빠른 상황 판단, 즉각적인 처치, 의료진과의 긴밀한 협업이 동시에 요구되는 공간입니다. 다양한 응급 케이스를 경험하며 단기간에 넓은 임상 역량을 쌓을 수 있다는 점, 그리고 매 순간 골든타임을 지켜냈을 때의 보람이 제가 원하는 '사회적 기여'와 정확히 맞닿아 있습니다. 매칭 점수 8점을 준 이유입니다. 다만 고강도 3교대 근무와 정신적 소진에 대한 철저한 준비가 필요합니다. 이것은 극복해야 할 과제이지, 포기 이유가 아닙니다.</w:t>
+      </w:r>
     </w:p>
     <w:p>
       <w:pPr>
-        <w:spacing w:after="80" w:before="120"/>
+        <w:spacing w:after="160"/>
+      </w:pPr>
+    </w:p>
+    <w:p>
+      <w:pPr>
+        <w:spacing w:after="80" w:before="160"/>
       </w:pPr>
       <w:r>
         <w:rPr>
@@ -287,17 +423,29 @@
           <w:color w:val="1E3A8A"/>
           <w:sz w:val="22"/>
         </w:rPr>
-        <w:t>2순위, 해외 간호사 USRN입니다. 글로벌 의료 환경과 높은 처우가 매력이지만, 의료 영어 구사력과 NCLEX-RN 취득이라는 높은 진입 장벽이 있습니다. 지금부터 준비해야 할 장기 과제입니다.</w:t>
+        <w:t>2순위, 해외 간호사 USRN입니다.</w:t>
       </w:r>
     </w:p>
     <w:p>
       <w:pPr>
-        <w:spacing w:after="120"/>
-      </w:pPr>
+        <w:spacing w:after="80"/>
+      </w:pPr>
+      <w:r>
+        <w:rPr>
+          <w:color w:val="1E293A"/>
+          <w:sz w:val="22"/>
+        </w:rPr>
+        <w:t>미국 등 해외 임상 환경은 체계적인 프로토콜, 합리적인 처우, 그리고 다문화 의료 경험이라는 큰 매력이 있습니다. 국내 경력을 쌓은 뒤 더 넓은 무대로 나가는 확장 경로로 고려하고 있습니다. 하지만 전문 의료 영어와 NCLEX-RN 취득은 지금부터 준비하지 않으면 늦는 장기 과제입니다.</w:t>
+      </w:r>
     </w:p>
     <w:p>
       <w:pPr>
-        <w:spacing w:after="80" w:before="120"/>
+        <w:spacing w:after="160"/>
+      </w:pPr>
+    </w:p>
+    <w:p>
+      <w:pPr>
+        <w:spacing w:after="80" w:before="160"/>
       </w:pPr>
       <w:r>
         <w:rPr>
@@ -305,13 +453,8 @@
           <w:color w:val="1E3A8A"/>
           <w:sz w:val="22"/>
         </w:rPr>
-        <w:t>3순위, 보건교사입니다. 안정적인 워라밸이 장점이나, 교직 이수 기회가 제한적이고 임용고시 경쟁이 치열합니다.</w:t>
+        <w:t>3순위, 보건교사입니다.</w:t>
       </w:r>
-    </w:p>
-    <w:p>
-      <w:pPr>
-        <w:spacing w:after="120"/>
-      </w:pPr>
     </w:p>
     <w:p>
       <w:pPr>
@@ -322,14 +465,31 @@
           <w:color w:val="1E293A"/>
           <w:sz w:val="22"/>
         </w:rPr>
-        <w:t>1학년인 지금 하나로 확정하지 않겠습니다. 세 후보를 유연하게 탐색하며, 학년마다 쌓이는 경험을 바탕으로 방향을 좁혀 나가겠습니다.</w:t>
+        <w:t>교육기관에서 학생 건강을 관리하는 안정적인 진로입니다. 워라밸이 뛰어나지만, 교직 이수 기회 자체가 제한적이고 임용고시 경쟁이 매우 치열합니다.</w:t>
+      </w:r>
+    </w:p>
+    <w:p>
+      <w:pPr>
+        <w:spacing w:after="160"/>
+      </w:pPr>
+    </w:p>
+    <w:p>
+      <w:pPr>
+        <w:spacing w:after="80"/>
+      </w:pPr>
+      <w:r>
+        <w:rPr>
+          <w:color w:val="1E293A"/>
+          <w:sz w:val="22"/>
+        </w:rPr>
+        <w:t>저는 1학년인 지금, 하나로 확정하지 않겠습니다. 세 가지 후보를 유연하게 탐색하면서, 학년마다 쌓이는 실습 경험과 역량을 기준으로 방향을 좁혀 나가겠습니다.</w:t>
       </w:r>
     </w:p>
     <w:p/>
     <w:p>
       <w:pPr>
         <w:pStyle w:val="Heading1"/>
-        <w:spacing w:before="320" w:after="80"/>
+        <w:spacing w:before="360" w:after="120"/>
       </w:pPr>
       <w:r>
         <w:rPr>
@@ -348,17 +508,17 @@
           <w:color w:val="1E293A"/>
           <w:sz w:val="22"/>
         </w:rPr>
-        <w:t>1학년 한 해의 SMART 목표를 6개 영역으로 설계했습니다.</w:t>
+        <w:t>진로 방향을 설정했다면, 지금 당장 무엇을 해야 하는지가 중요합니다. 1학년 한 해의 SMART 목표를 학업·진로·대인역량·경험·외국어·건강, 총 6개 영역으로 나눠 설계했습니다.</w:t>
       </w:r>
     </w:p>
     <w:p>
       <w:pPr>
-        <w:spacing w:after="120"/>
+        <w:spacing w:after="160"/>
       </w:pPr>
     </w:p>
     <w:p>
       <w:pPr>
-        <w:spacing w:after="80" w:before="120"/>
+        <w:spacing w:after="80" w:before="160"/>
       </w:pPr>
       <w:r>
         <w:rPr>
@@ -366,17 +526,29 @@
           <w:color w:val="1E3A8A"/>
           <w:sz w:val="22"/>
         </w:rPr>
-        <w:t>📚 학업 — 인간 심리의 이해 A 이상. 매주 일요일 2시간 전공 복습 루틴을 12월까지 유지합니다.</w:t>
+        <w:t>📚 학업</w:t>
       </w:r>
     </w:p>
     <w:p>
       <w:pPr>
-        <w:spacing w:after="120"/>
-      </w:pPr>
+        <w:spacing w:after="80"/>
+      </w:pPr>
+      <w:r>
+        <w:rPr>
+          <w:color w:val="1E293A"/>
+          <w:sz w:val="22"/>
+        </w:rPr>
+        <w:t>1학기 인간 심리의 이해 과목에서 A 이상을 목표로 합니다. 이를 위해 매주 일요일 저녁 2시간, 그 주에 배운 핵심 전공 내용을 복습하는 루틴을 12월까지 유지하겠습니다. 간호학은 기초가 흔들리면 임상 실습에서 반드시 무너집니다. 지금의 복습 루틴이 3학년 실습의 토대가 됩니다.</w:t>
+      </w:r>
     </w:p>
     <w:p>
       <w:pPr>
-        <w:spacing w:after="80" w:before="120"/>
+        <w:spacing w:after="160"/>
+      </w:pPr>
+    </w:p>
+    <w:p>
+      <w:pPr>
+        <w:spacing w:after="80" w:before="160"/>
       </w:pPr>
       <w:r>
         <w:rPr>
@@ -384,17 +556,29 @@
           <w:color w:val="1E3A8A"/>
           <w:sz w:val="22"/>
         </w:rPr>
-        <w:t>🧭 진로 — 5월까지 학과 진로상담 1회 완료. 여름방학 중 응급실 현직 간호사 인터뷰 또는 견학을 최소 한 차례 추진합니다. 교과서 속 응급실과 실제 현장의 차이를 1학년 때 직접 확인하고 싶습니다.</w:t>
+        <w:t>🧭 진로</w:t>
       </w:r>
     </w:p>
     <w:p>
       <w:pPr>
-        <w:spacing w:after="120"/>
-      </w:pPr>
+        <w:spacing w:after="80"/>
+      </w:pPr>
+      <w:r>
+        <w:rPr>
+          <w:color w:val="1E293A"/>
+          <w:sz w:val="22"/>
+        </w:rPr>
+        <w:t>5월까지 학과 진로상담을 최소 1회 완료합니다. 그리고 여름방학 중 응급실 현직 간호사 인터뷰 또는 병원 견학을 한 차례 이상 직접 추진하겠습니다. 교과서와 실제 현장 사이의 간극을 1학년 때 눈으로 확인하는 것, 이게 제가 이 목표를 세운 이유입니다.</w:t>
+      </w:r>
     </w:p>
     <w:p>
       <w:pPr>
-        <w:spacing w:after="80" w:before="120"/>
+        <w:spacing w:after="160"/>
+      </w:pPr>
+    </w:p>
+    <w:p>
+      <w:pPr>
+        <w:spacing w:after="80" w:before="160"/>
       </w:pPr>
       <w:r>
         <w:rPr>
@@ -402,17 +586,29 @@
           <w:color w:val="1E3A8A"/>
           <w:sz w:val="22"/>
         </w:rPr>
-        <w:t>🤝 대인역량 — 전공 스터디 그룹에 적극 참여합니다. 의료 현장은 혼자 움직이는 공간이 아닙니다.</w:t>
+        <w:t>🤝 대인역량</w:t>
       </w:r>
     </w:p>
     <w:p>
       <w:pPr>
-        <w:spacing w:after="120"/>
-      </w:pPr>
+        <w:spacing w:after="80"/>
+      </w:pPr>
+      <w:r>
+        <w:rPr>
+          <w:color w:val="1E293A"/>
+          <w:sz w:val="22"/>
+        </w:rPr>
+        <w:t>전공 스터디 그룹에 적극 참여하고, 가능하다면 직접 이끌겠습니다. 응급 현장에서 간호사는 절대 혼자 움직이지 않습니다. 팀워크와 커뮤니케이션은 지금 학교에서부터 쌓아야 합니다.</w:t>
+      </w:r>
     </w:p>
     <w:p>
       <w:pPr>
-        <w:spacing w:after="80" w:before="120"/>
+        <w:spacing w:after="160"/>
+      </w:pPr>
+    </w:p>
+    <w:p>
+      <w:pPr>
+        <w:spacing w:after="80" w:before="160"/>
       </w:pPr>
       <w:r>
         <w:rPr>
@@ -420,17 +616,29 @@
           <w:color w:val="1E3A8A"/>
           <w:sz w:val="22"/>
         </w:rPr>
-        <w:t>❤️ 경험 — 여름방학 지역 보건·의료기관 봉사활동 30시간을 공식 일지와 함께 수료합니다.</w:t>
+        <w:t>❤️ 경험</w:t>
       </w:r>
     </w:p>
     <w:p>
       <w:pPr>
-        <w:spacing w:after="120"/>
-      </w:pPr>
+        <w:spacing w:after="80"/>
+      </w:pPr>
+      <w:r>
+        <w:rPr>
+          <w:color w:val="1E293A"/>
+          <w:sz w:val="22"/>
+        </w:rPr>
+        <w:t>여름방학 기간, 지역 보건·의료기관 연계 봉사활동 30시간을 공식 일지와 함께 수료합니다. 실제 환자 곁에 서는 경험은 어떤 수업보다 강렬한 공부입니다.</w:t>
+      </w:r>
     </w:p>
     <w:p>
       <w:pPr>
-        <w:spacing w:after="80" w:before="120"/>
+        <w:spacing w:after="160"/>
+      </w:pPr>
+    </w:p>
+    <w:p>
+      <w:pPr>
+        <w:spacing w:after="80" w:before="160"/>
       </w:pPr>
       <w:r>
         <w:rPr>
@@ -438,17 +646,29 @@
           <w:color w:val="1E3A8A"/>
           <w:sz w:val="22"/>
         </w:rPr>
-        <w:t>🌐 외국어 — 12월까지 토익 700점 이상 취득. 매일 의학용어 5개를 암기합니다. USRN 가능성을 열어 두기 위한 최소한의 준비입니다.</w:t>
+        <w:t>🌐 외국어</w:t>
       </w:r>
     </w:p>
     <w:p>
       <w:pPr>
-        <w:spacing w:after="120"/>
-      </w:pPr>
+        <w:spacing w:after="80"/>
+      </w:pPr>
+      <w:r>
+        <w:rPr>
+          <w:color w:val="1E293A"/>
+          <w:sz w:val="22"/>
+        </w:rPr>
+        <w:t>12월까지 토익 700점 이상을 취득하고, 매일 영문 의학용어 5개를 암기합니다. USRN의 가능성을 열어 두기 위한 최소한의 준비이자, 3학년 이후 해외 논문 독해를 위한 사전 투자입니다.</w:t>
+      </w:r>
     </w:p>
     <w:p>
       <w:pPr>
-        <w:spacing w:after="80" w:before="120"/>
+        <w:spacing w:after="160"/>
+      </w:pPr>
+    </w:p>
+    <w:p>
+      <w:pPr>
+        <w:spacing w:after="80" w:before="160"/>
       </w:pPr>
       <w:r>
         <w:rPr>
@@ -456,14 +676,26 @@
           <w:color w:val="1E3A8A"/>
           <w:sz w:val="22"/>
         </w:rPr>
-        <w:t>💪 건강 — 주 3회 30분 이상 유산소 운동, 매일 6시간 이상 수면. 3교대 근무를 버텨낼 체력은 지금부터 쌓아야 합니다.</w:t>
+        <w:t>💪 건강</w:t>
+      </w:r>
+    </w:p>
+    <w:p>
+      <w:pPr>
+        <w:spacing w:after="80"/>
+      </w:pPr>
+      <w:r>
+        <w:rPr>
+          <w:color w:val="1E293A"/>
+          <w:sz w:val="22"/>
+        </w:rPr>
+        <w:t>주 3회 30분 이상 유산소 운동, 매일 6시간 이상 수면을 지킵니다. 3교대 근무의 강도를 버텨낼 체력은 지금부터 저축해야 합니다. 건강 관리는 선택이 아니라 미래 직업을 위한 필수 준비입니다.</w:t>
       </w:r>
     </w:p>
     <w:p/>
     <w:p>
       <w:pPr>
         <w:pStyle w:val="Heading1"/>
-        <w:spacing w:before="320" w:after="80"/>
+        <w:spacing w:before="360" w:after="120"/>
       </w:pPr>
       <w:r>
         <w:rPr>
@@ -482,17 +714,17 @@
           <w:color w:val="1E293A"/>
           <w:sz w:val="22"/>
         </w:rPr>
-        <w:t>1학년 기초 위에 2학년부터 4학년까지의 로드맵입니다.</w:t>
+        <w:t>1학년의 기초 위에 2학년부터 4학년까지의 중기 로드맵을 설계했습니다. 각 학년마다 반드시 달성해야 할 핵심 과업을 세 가지 영역으로 나눴습니다.</w:t>
       </w:r>
     </w:p>
     <w:p>
       <w:pPr>
-        <w:spacing w:after="120"/>
+        <w:spacing w:after="160"/>
       </w:pPr>
     </w:p>
     <w:p>
       <w:pPr>
-        <w:spacing w:after="80" w:before="120"/>
+        <w:spacing w:after="80" w:before="160"/>
       </w:pPr>
       <w:r>
         <w:rPr>
@@ -512,17 +744,17 @@
           <w:color w:val="1E293A"/>
           <w:sz w:val="22"/>
         </w:rPr>
-        <w:t>병태생리학·약리학·건강사정 등 임상 핵심 전공을 이수하며 기초 의학 지식을 다집니다. 교직 이수 신청 여부를 이 시기에 최종 결정합니다. 더 미루면 선택지가 닫힙니다. 토익 800점 이상과 응급실 선배 인터뷰도 이 시기 목표입니다.</w:t>
+        <w:t>학업 측면에서는 병태생리학, 약리학, 건강사정 등 임상 간호의 핵심 과목들을 충실히 이수합니다. 이 시기의 전공 성적이 3학년 실습 배치에 직접 영향을 줍니다. 진로 측면에서는 교직 이수 신청 여부를 이 시기에 최종 결정합니다. 보건교사를 선택한다면 더 이상 미룰 수 없는 시점입니다. 역량 측면에서는 토익 800점 이상을 달성하고, 응급실 선배 간호사와의 심층 인터뷰를 통해 현장 요구 역량을 구체적으로 파악하겠습니다.</w:t>
       </w:r>
     </w:p>
     <w:p>
       <w:pPr>
-        <w:spacing w:after="120"/>
+        <w:spacing w:after="160"/>
       </w:pPr>
     </w:p>
     <w:p>
       <w:pPr>
-        <w:spacing w:after="80" w:before="120"/>
+        <w:spacing w:after="80" w:before="160"/>
       </w:pPr>
       <w:r>
         <w:rPr>
@@ -542,17 +774,17 @@
           <w:color w:val="1E293A"/>
           <w:sz w:val="22"/>
         </w:rPr>
-        <w:t>병원 실습이 시작됩니다. 응급실·수술실 실습에 집중 배치받기 위해 적극적으로 의사를 표현할 것입니다. 단순 관찰이 아닌, 질문하고 배우는 능동적 자세를 유지하겠습니다. NCLEX-RN 준비 자료 수집도 이 시기에 시작합니다.</w:t>
+        <w:t>이 시기가 로드맵의 핵심입니다. 병원 실습이 시작되며, 저는 응급실과 수술실 실습에 적극적으로 집중 배치를 요청할 것입니다. 실습 현장에서 단순한 관찰자가 아닌, 질문하고 기록하고 배우는 능동적인 자세를 유지하겠습니다. 해외 진출 가능성을 위해 NCLEX-RN 준비 자료 수집도 이 시기에 시작합니다. 학술대회 포스터 발표에도 도전해볼 계획입니다.</w:t>
       </w:r>
     </w:p>
     <w:p>
       <w:pPr>
-        <w:spacing w:after="120"/>
+        <w:spacing w:after="160"/>
       </w:pPr>
     </w:p>
     <w:p>
       <w:pPr>
-        <w:spacing w:after="80" w:before="120"/>
+        <w:spacing w:after="80" w:before="160"/>
       </w:pPr>
       <w:r>
         <w:rPr>
@@ -572,12 +804,12 @@
           <w:color w:val="1E293A"/>
           <w:sz w:val="22"/>
         </w:rPr>
-        <w:t>간호사 국가고시 합격과 종합병원 공채 대비에 집중합니다. 응급실 맞춤형 자기소개서를 완성하고, 모의면접으로 실전 감각을 익힙니다.</w:t>
+        <w:t>모든 에너지를 간호사 국가고시 합격과 종합병원 공개 채용 준비에 집중합니다. 응급실 맞춤형 자기소개서를 완성하고, 교내외 모의면접 프로그램을 통해 실전 감각을 키웁니다. 해외 진출을 선택했다면 이 시기에 NCLEX 모의문제 풀이를 본격 시작합니다.</w:t>
       </w:r>
     </w:p>
     <w:p>
       <w:pPr>
-        <w:spacing w:after="120"/>
+        <w:spacing w:after="160"/>
       </w:pPr>
     </w:p>
     <w:p>
@@ -589,14 +821,14 @@
           <w:color w:val="1E293A"/>
           <w:sz w:val="22"/>
         </w:rPr>
-        <w:t>이 로드맵은 고정된 계획이 아닙니다. 학년마다 얻는 경험에 따라 능동적으로 수정합니다.</w:t>
+        <w:t>이 로드맵은 고정된 계획이 아닙니다. 매 학년 말 반드시 점검하고, 실제 경험과 상황에 따라 능동적으로 수정해 나가겠습니다.</w:t>
       </w:r>
     </w:p>
     <w:p/>
     <w:p>
       <w:pPr>
         <w:pStyle w:val="Heading1"/>
-        <w:spacing w:before="320" w:after="80"/>
+        <w:spacing w:before="360" w:after="120"/>
       </w:pPr>
       <w:r>
         <w:rPr>
@@ -615,12 +847,12 @@
           <w:color w:val="1E293A"/>
           <w:sz w:val="22"/>
         </w:rPr>
-        <w:t>졸업 후 5년, 저의 목표는 종합병원 응급실 3년차 간호사입니다.</w:t>
+        <w:t>졸업하고 5년이 지난 후, 저는 어떤 모습이어야 할까요?</w:t>
       </w:r>
     </w:p>
     <w:p>
       <w:pPr>
-        <w:spacing w:after="120"/>
+        <w:spacing w:after="160"/>
       </w:pPr>
     </w:p>
     <w:p>
@@ -632,12 +864,12 @@
           <w:color w:val="1E293A"/>
           <w:sz w:val="22"/>
         </w:rPr>
-        <w:t>취업에 성공한 것을 넘어, 응급 환경에서 신뢰받는 전문가로 자리 잡은 모습입니다. 신속한 의사결정과 책임감 있는 태도로 환자의 골든타임을 지키고, 신입 간호사들을 교육하며 팀을 이끄는 역할도 맡고 싶습니다. 제가 받은 가르침을 다음 세대에게 돌려주는 것 또한 사회적 기여입니다.</w:t>
+        <w:t>저의 목표는 종합병원 응급실의 3년차 간호사입니다. 단순히 취업에 성공한 것이 아니라, 응급 환경에서 실력으로 신뢰를 얻은 전문가로 자리 잡은 모습입니다.</w:t>
       </w:r>
     </w:p>
     <w:p>
       <w:pPr>
-        <w:spacing w:after="120"/>
+        <w:spacing w:after="160"/>
       </w:pPr>
     </w:p>
     <w:p>
@@ -649,12 +881,12 @@
           <w:color w:val="1E293A"/>
           <w:sz w:val="22"/>
         </w:rPr>
-        <w:t>동시에 글로벌 트랙의 가능성도 열어 둡니다. 국내 응급실 임상 경력을 기반으로 NCLEX-RN을 취득해 해외 의료 현장에서 환자를 돌보는 미래도 그리고 있습니다.</w:t>
+        <w:t>신속한 의사결정, 흔들리지 않는 책임감, 그리고 의료진과의 유기적인 협업으로 환자의 골든타임을 매번 지켜내는 간호사. 어떤 상황에서도 당황하지 않고 프로토콜에 따라 정확하게 움직이는 사람. 그것이 5년 후 제가 목표로 하는 모습입니다.</w:t>
       </w:r>
     </w:p>
     <w:p>
       <w:pPr>
-        <w:spacing w:after="120"/>
+        <w:spacing w:after="160"/>
       </w:pPr>
     </w:p>
     <w:p>
@@ -666,14 +898,48 @@
           <w:color w:val="1E293A"/>
           <w:sz w:val="22"/>
         </w:rPr>
-        <w:t>5년 후의 저는, 어떤 길을 선택했든 자신의 선택을 후회하지 않을 준비를 지금 하고 있는 사람입니다.</w:t>
+        <w:t>임상 역량 측면에서는, 중증 응급 환자 간호 경험을 꾸준히 쌓으면서 정기 학술대회 참가를 통해 최신 응급의학 동향을 놓치지 않겠습니다. 그리고 3년차가 되면 신입 간호사들을 교육하는 역할도 맡고 싶습니다. 제가 받은 가르침을 다음 세대에게 돌려주는 것, 그것 또한 제가 원하는 사회적 기여의 한 형태입니다.</w:t>
+      </w:r>
+    </w:p>
+    <w:p>
+      <w:pPr>
+        <w:spacing w:after="160"/>
+      </w:pPr>
+    </w:p>
+    <w:p>
+      <w:pPr>
+        <w:spacing w:after="80"/>
+      </w:pPr>
+      <w:r>
+        <w:rPr>
+          <w:color w:val="1E293A"/>
+          <w:sz w:val="22"/>
+        </w:rPr>
+        <w:t>동시에 글로벌 트랙의 가능성도 열어 둡니다. 국내 응급실에서 쌓은 탄탄한 임상 경력을 바탕으로 NCLEX-RN을 취득해, 미국을 비롯한 해외 의료 현장에서 환자를 돌보는 미래도 진지하게 그리고 있습니다.</w:t>
+      </w:r>
+    </w:p>
+    <w:p>
+      <w:pPr>
+        <w:spacing w:after="160"/>
+      </w:pPr>
+    </w:p>
+    <w:p>
+      <w:pPr>
+        <w:spacing w:after="80"/>
+      </w:pPr>
+      <w:r>
+        <w:rPr>
+          <w:color w:val="1E293A"/>
+          <w:sz w:val="22"/>
+        </w:rPr>
+        <w:t>5년 후의 저는, 어느 트랙을 선택했든 자신의 선택을 후회하지 않을 만큼 충분히 준비한 사람이어야 합니다. 그 준비를 오늘 시작합니다.</w:t>
       </w:r>
     </w:p>
     <w:p/>
     <w:p>
       <w:pPr>
         <w:pStyle w:val="Heading1"/>
-        <w:spacing w:before="320" w:after="80"/>
+        <w:spacing w:before="360" w:after="120"/>
       </w:pPr>
       <w:r>
         <w:rPr>
@@ -692,17 +958,34 @@
           <w:color w:val="1E293A"/>
           <w:sz w:val="22"/>
         </w:rPr>
-        <w:t>모든 계획은 실천이 뒤따르지 않으면 의미가 없습니다. 이번 학기 안에 반드시 두 가지를 실행하겠습니다.</w:t>
+        <w:t>지금까지 발표한 모든 계획은 실천이 뒤따르지 않으면 아무 의미가 없습니다. 이번 슬라이드는 그 실천의 시작입니다.</w:t>
       </w:r>
     </w:p>
     <w:p>
       <w:pPr>
-        <w:spacing w:after="120"/>
+        <w:spacing w:after="160"/>
       </w:pPr>
     </w:p>
     <w:p>
       <w:pPr>
-        <w:spacing w:after="80" w:before="120"/>
+        <w:spacing w:after="80"/>
+      </w:pPr>
+      <w:r>
+        <w:rPr>
+          <w:color w:val="1E293A"/>
+          <w:sz w:val="22"/>
+        </w:rPr>
+        <w:t>저는 이번 학기 안에 반드시 두 가지를 실행하겠습니다. '하겠다'가 아닌, 저 자신과의 서약입니다.</w:t>
+      </w:r>
+    </w:p>
+    <w:p>
+      <w:pPr>
+        <w:spacing w:after="160"/>
+      </w:pPr>
+    </w:p>
+    <w:p>
+      <w:pPr>
+        <w:spacing w:after="80" w:before="160"/>
       </w:pPr>
       <w:r>
         <w:rPr>
@@ -722,17 +1005,34 @@
           <w:color w:val="1E293A"/>
           <w:sz w:val="22"/>
         </w:rPr>
-        <w:t>1365 자원봉사 포털 또는 학교 연계 의료기관을 통해 방학 봉사 일정을 지금 바로 확보합니다. "방학 되면 하지"가 아닙니다.</w:t>
+        <w:t>1365 자원봉사 포털 또는 학교 연계 지역 의료기관 사이트를 통해 여름방학 봉사 일정을 이번 달 안에 직접 잡겠습니다. "방학이 되면 신청하지"가 아닙니다. 지금 당장 경로를 확인하고, 이번 달 안에 신청을 완료합니다.</w:t>
       </w:r>
     </w:p>
     <w:p>
       <w:pPr>
-        <w:spacing w:after="120"/>
+        <w:spacing w:after="160"/>
       </w:pPr>
     </w:p>
     <w:p>
       <w:pPr>
-        <w:spacing w:after="80" w:before="120"/>
+        <w:spacing w:after="80"/>
+      </w:pPr>
+      <w:r>
+        <w:rPr>
+          <w:color w:val="1E293A"/>
+          <w:sz w:val="22"/>
+        </w:rPr>
+        <w:t>구체적인 실행 전술은 다음과 같습니다. 이번 주 안에 1365 포털에 로그인해 원주 지역 의료 봉사 목록을 검색합니다. 가능한 일정 세 가지를 추려 이번 달 안에 신청 버튼을 누릅니다.</w:t>
+      </w:r>
+    </w:p>
+    <w:p>
+      <w:pPr>
+        <w:spacing w:after="160"/>
+      </w:pPr>
+    </w:p>
+    <w:p>
+      <w:pPr>
+        <w:spacing w:after="80" w:before="160"/>
       </w:pPr>
       <w:r>
         <w:rPr>
@@ -752,12 +1052,12 @@
           <w:color w:val="1E293A"/>
           <w:sz w:val="22"/>
         </w:rPr>
-        <w:t>교내 도서관 또는 집 서재에서 휴대폰 알림을 차단하고 전공 서적을 펼칩니다. 매주 성공하면 플래너에 체크 마크를 남기고, 학기 말에 그 기록을 스스로 돌아봅니다.</w:t>
+        <w:t>장소는 교내 도서관 또는 집 서재. 시간은 일요일 저녁 8시. 시작 전 휴대폰 알림을 전면 차단합니다. 2시간 동안 그 주에 배운 전공 핵심 내용을 정리합니다. 끝나면 플래너에 체크 마크를 남깁니다. 학기 말에 그 체크 마크의 줄을 스스로 세어봅니다.</w:t>
       </w:r>
     </w:p>
     <w:p>
       <w:pPr>
-        <w:spacing w:after="120"/>
+        <w:spacing w:after="160"/>
       </w:pPr>
     </w:p>
     <w:p>
@@ -769,12 +1069,12 @@
           <w:color w:val="1E293A"/>
           <w:sz w:val="22"/>
         </w:rPr>
-        <w:t>이 두 가지가 작아 보일 수 있습니다. 하지만 응급실 간호사를 향한 가장 정직한 첫걸음은 바로 이 작은 약속을 지켜내는 것이라고 믿습니다.</w:t>
+        <w:t>이 두 가지가 작아 보일 수 있습니다. 하지만 저는 이것이 응급실 간호사를 향한 가장 정직한 첫걸음이라고 확신합니다.</w:t>
       </w:r>
     </w:p>
     <w:p>
       <w:pPr>
-        <w:spacing w:after="120"/>
+        <w:spacing w:after="160"/>
       </w:pPr>
     </w:p>
     <w:p>
@@ -793,7 +1093,7 @@
     <w:p>
       <w:pPr>
         <w:pStyle w:val="Heading1"/>
-        <w:spacing w:before="320" w:after="80"/>
+        <w:spacing w:before="360" w:after="120"/>
       </w:pPr>
       <w:r>
         <w:rPr>
@@ -817,7 +1117,7 @@
     </w:p>
     <w:p>
       <w:pPr>
-        <w:spacing w:after="120"/>
+        <w:spacing w:after="160"/>
       </w:pPr>
     </w:p>
     <w:p>
@@ -829,12 +1129,12 @@
           <w:color w:val="1E293A"/>
           <w:sz w:val="22"/>
         </w:rPr>
-        <w:t>4년 뒤 이 계획이 그대로일 거라 생각하지 않습니다. 실습을 하며 생각이 바뀔 수도 있고, 예상치 못한 기회가 올 수도 있습니다. 하지만 지금 이 순간 내가 어디로 가고 싶은지 알고 있다는 것, 그리고 그 방향을 향해 오늘부터 움직인다는 것. 그것으로 충분합니다.</w:t>
+        <w:t>이 문장을 발표를 준비하는 내내 마음에 새겼습니다.</w:t>
       </w:r>
     </w:p>
     <w:p>
       <w:pPr>
-        <w:spacing w:after="120"/>
+        <w:spacing w:after="160"/>
       </w:pPr>
     </w:p>
     <w:p>
@@ -846,12 +1146,12 @@
           <w:color w:val="1E293A"/>
           <w:sz w:val="22"/>
         </w:rPr>
-        <w:t>오늘 이 발표가 저의 두 번째 용기 있는 출발점이 되겠습니다.</w:t>
+        <w:t>솔직히 말씀드리면, 오늘 이 발표를 준비하면서 확신이 섰던 순간과 흔들렸던 순간이 반반이었습니다. '과연 내가 응급실의 강도를 버텨낼 수 있을까', '4년 안에 이 모든 걸 다 해낼 수 있을까'라는 의문도 들었습니다.</w:t>
       </w:r>
     </w:p>
     <w:p>
       <w:pPr>
-        <w:spacing w:after="120"/>
+        <w:spacing w:after="160"/>
       </w:pPr>
     </w:p>
     <w:p>
@@ -863,7 +1163,58 @@
           <w:color w:val="1E293A"/>
           <w:sz w:val="22"/>
         </w:rPr>
-        <w:t>끝까지 들어주셔서 진심으로 감사합니다.</w:t>
+        <w:t>하지만 동시에 알게 됐습니다. 지금 제가 세운 계획이 4년 뒤에도 그대로일 거라고 생각하지 않는다는 것을. 실습을 하며 생각이 바뀔 수도 있고, 예상치 못한 기회가 찾아올 수도 있습니다. 그래도 괜찮습니다.</w:t>
+      </w:r>
+    </w:p>
+    <w:p>
+      <w:pPr>
+        <w:spacing w:after="160"/>
+      </w:pPr>
+    </w:p>
+    <w:p>
+      <w:pPr>
+        <w:spacing w:after="80"/>
+      </w:pPr>
+      <w:r>
+        <w:rPr>
+          <w:color w:val="1E293A"/>
+          <w:sz w:val="22"/>
+        </w:rPr>
+        <w:t>중요한 건, 지금 이 순간 내가 어디로 가고 싶은지 알고 있다는 것. 그리고 그 방향을 향해 오늘 이 자리에서 공개적으로 선언했다는 것입니다.</w:t>
+      </w:r>
+    </w:p>
+    <w:p>
+      <w:pPr>
+        <w:spacing w:after="160"/>
+      </w:pPr>
+    </w:p>
+    <w:p>
+      <w:pPr>
+        <w:spacing w:after="80"/>
+      </w:pPr>
+      <w:r>
+        <w:rPr>
+          <w:color w:val="1E293A"/>
+          <w:sz w:val="22"/>
+        </w:rPr>
+        <w:t>강원대학교 간호학과에 입학한 것이 저의 첫 번째 용기 있는 선택이었다면, 오늘 이 발표는 저의 두 번째 출발점이 됩니다.</w:t>
+      </w:r>
+    </w:p>
+    <w:p>
+      <w:pPr>
+        <w:spacing w:after="160"/>
+      </w:pPr>
+    </w:p>
+    <w:p>
+      <w:pPr>
+        <w:spacing w:after="80"/>
+      </w:pPr>
+      <w:r>
+        <w:rPr>
+          <w:color w:val="1E293A"/>
+          <w:sz w:val="22"/>
+        </w:rPr>
+        <w:t>부족한 발표 끝까지 들어주셔서 진심으로 감사합니다.</w:t>
       </w:r>
     </w:p>
     <w:p/>

</xml_diff>

<commit_message>
extend scripts to ~12min (4,262 Hangul syllables)
전 슬라이드 대본 분량 추가. 한글 음절 4,262자.
350음절/분 기준 약 12.2분.

Co-Authored-By: Claude Sonnet 4.6 <noreply@anthropic.com>
</commit_message>
<xml_diff>
--- a/발표대본_김종민.docx
+++ b/발표대본_김종민.docx
@@ -37,7 +37,7 @@
           <w:color w:val="94A3B8"/>
           <w:sz w:val="20"/>
         </w:rPr>
-        <w:t>※ 예상 발표 시간: 약 10분  (350음절/분 기준)</w:t>
+        <w:t>※ 예상 발표 시간: 약 12분  (350음절/분 기준)</w:t>
       </w:r>
     </w:p>
     <w:p/>
@@ -97,7 +97,7 @@
           <w:color w:val="1E293A"/>
           <w:sz w:val="22"/>
         </w:rPr>
-        <w:t>이 발표를 준비하기 전, 저는 스스로에게 이런 질문을 던졌습니다. "나는 왜 간호학과에 왔는가?" 막연하게 '간호사가 되고 싶다'는 생각만으로 여기 서 있는 건 아닌지, 정말 내가 무엇을 원하는 사람인지를 먼저 확인하고 싶었습니다.</w:t>
+        <w:t>이 발표를 준비하기 전, 저는 스스로에게 이런 질문을 던졌습니다. "나는 왜 간호학과를 선택했는가?" 막연하게 '간호사가 되면 좋겠다'는 생각만으로 여기 서 있는 건 아닌지, 정말 내가 어떤 사람인지, 무엇을 원하는지를 먼저 확인하고 싶었습니다. 그래서 자기이해 검사를 활용했고, 그 결과를 출발점으로 삼아 1학년의 목표부터 4년간의 로드맵, 그리고 졸업 후 5년의 비전까지를 이 발표에 담았습니다.</w:t>
       </w:r>
     </w:p>
     <w:p>
@@ -114,24 +114,7 @@
           <w:color w:val="1E293A"/>
           <w:sz w:val="22"/>
         </w:rPr>
-        <w:t>그 답을 찾기 위해 자기이해 검사를 활용했고, 그 결과를 출발점으로 삼아 1학년의 목표부터 4년간의 로드맵, 그리고 졸업 후 5년의 비전까지를 이 발표에 담았습니다.</w:t>
-      </w:r>
-    </w:p>
-    <w:p>
-      <w:pPr>
-        <w:spacing w:after="160"/>
-      </w:pPr>
-    </w:p>
-    <w:p>
-      <w:pPr>
-        <w:spacing w:after="80"/>
-      </w:pPr>
-      <w:r>
-        <w:rPr>
-          <w:color w:val="1E293A"/>
-          <w:sz w:val="22"/>
-        </w:rPr>
-        <w:t>저의 비전은 딱 한 문장입니다.</w:t>
+        <w:t>저의 비전은 딱 한 문장으로 정리됩니다.</w:t>
       </w:r>
     </w:p>
     <w:p>
@@ -165,7 +148,7 @@
           <w:color w:val="1E293A"/>
           <w:sz w:val="22"/>
         </w:rPr>
-        <w:t>단순히 간호사가 되겠다는 목표가 아닙니다. 어떤 간호사가 될 것인지, 어떻게 준비할 것인지를 오늘 이 자리에서 구체적으로 말씀드리겠습니다. 그럼 시작하겠습니다.</w:t>
+        <w:t>단순히 간호사가 되겠다는 목표가 아닙니다. 어떤 간호사가 될 것인지, 어떻게 준비할 것인지, 왜 그 길을 선택했는지를 오늘 이 자리에서 구체적으로 말씀드리겠습니다. 그럼 지금부터 시작하겠습니다.</w:t>
       </w:r>
     </w:p>
     <w:p/>
@@ -238,7 +221,7 @@
           <w:color w:val="1E293A"/>
           <w:sz w:val="22"/>
         </w:rPr>
-        <w:t>저는 급여나 안정성보다 제가 하는 일이 타인과 사회에 실질적으로 도움이 될 때 훨씬 더 큰 보람을 느끼는 사람이라는 것이 검사에서 분명하게 드러났습니다. 이 결과를 보고 저는 사실 놀라지 않았습니다. 돌이켜보면, 중학교 때 처음 봉사활동을 나갔던 날의 뿌듯함이 아직도 기억에 남아 있거든요.</w:t>
+        <w:t>저는 급여나 안정성보다 제가 하는 일이 타인과 사회에 실질적으로 도움이 될 때 훨씬 더 큰 보람을 느끼는 사람이라는 것이 검사에서 분명하게 드러났습니다. 이 결과를 보고 저는 사실 놀라지 않았습니다. 중학교 때 처음 봉사활동을 나갔던 날, 어르신의 손을 잡아드렸을 때 느꼈던 뿌듯함이 아직도 생생하게 기억에 남아 있거든요. 그때의 감정이 저를 간호학과로 이끌었다는 걸 이번 검사를 통해 다시 한번 확인했습니다.</w:t>
       </w:r>
     </w:p>
     <w:p>
@@ -268,7 +251,7 @@
           <w:color w:val="1E293A"/>
           <w:sz w:val="22"/>
         </w:rPr>
-        <w:t>맡은 일은 반드시 끝까지 완수하고, 기준 이하의 결과물에는 타협하지 않는 성향이 뚜렷하게 나타났습니다. 간호직은 매 순간 환자의 안전에 직결된 책임을 져야 하는 직업입니다. 그 책임을 감당할 수 있는 성향이 제게 있다는 것을 이번 검사를 통해 다시 한번 확인했습니다.</w:t>
+        <w:t>맡은 일은 반드시 끝까지 완수하고, 기준 이하의 결과물에는 타협하지 않는 성향이 뚜렷하게 나타났습니다. 간호직은 매 순간 환자의 안전에 직결된 책임을 져야 하는 직업입니다. 약 하나를 잘못 투약하거나, 활력징후 하나를 놓치는 것이 환자의 생사에 영향을 줄 수 있습니다. 그 무게를 감당할 수 있는 성향이 제게 있다는 것을 이번 검사를 통해 다시 한번 확인했습니다.</w:t>
       </w:r>
     </w:p>
     <w:p>
@@ -298,7 +281,7 @@
           <w:color w:val="1E293A"/>
           <w:sz w:val="22"/>
         </w:rPr>
-        <w:t>긴박하고 즉각적인 판단이 요구되는 환경에서 오히려 집중력이 올라가고 성취감을 느끼는 기질이 검사에서도 확인됐습니다. 평소에 느꼈던 것과 완전히 일치했습니다.</w:t>
+        <w:t>긴박하고 즉각적인 판단이 요구되는 환경에서 오히려 집중력이 올라가고 성취감을 느끼는 기질이 확인됐습니다. 루틴한 업무보다 매 순간 다른 상황에 대응해야 하는 환경을 선호한다는 결과도 함께 나왔습니다.</w:t>
       </w:r>
     </w:p>
     <w:p>
@@ -349,7 +332,7 @@
           <w:color w:val="1E293A"/>
           <w:sz w:val="22"/>
         </w:rPr>
-        <w:t>이 문장이 오늘 발표 전체의 출발점이자 제 진로 설계의 근거입니다.</w:t>
+        <w:t>이 문장이 오늘 발표 전체의 출발점이자, 제 진로 설계 전체를 관통하는 근거입니다.</w:t>
       </w:r>
     </w:p>
     <w:p/>
@@ -405,7 +388,7 @@
           <w:color w:val="1E293A"/>
           <w:sz w:val="22"/>
         </w:rPr>
-        <w:t>응급실은 환자의 생사가 결정되는 최전선입니다. 빠른 상황 판단, 즉각적인 처치, 의료진과의 긴밀한 협업이 동시에 요구되는 공간입니다. 다양한 응급 케이스를 경험하며 단기간에 넓은 임상 역량을 쌓을 수 있다는 점, 그리고 매 순간 골든타임을 지켜냈을 때의 보람이 제가 원하는 '사회적 기여'와 정확히 맞닿아 있습니다. 매칭 점수 8점을 준 이유입니다. 다만 고강도 3교대 근무와 정신적 소진에 대한 철저한 준비가 필요합니다. 이것은 극복해야 할 과제이지, 포기 이유가 아닙니다.</w:t>
+        <w:t>응급실은 환자의 생사가 결정되는 최전선입니다. 심정지, 외상, 뇌졸중 등 다양한 중증 응급 케이스를 다루며, 빠른 상황 판단과 즉각적인 처치, 의료진과의 긴밀한 협업이 동시에 요구되는 공간입니다. 다양한 응급 케이스를 경험하며 단기간에 넓은 임상 역량을 쌓을 수 있다는 점, 그리고 매 순간 골든타임을 지켜냈을 때의 보람이 제가 원하는 '사회적 기여'와 정확히 맞닿아 있습니다. 그래서 매칭 점수를 8점으로 가장 높게 줬습니다. 물론 고강도 3교대 근무와 정신적 소진에 대한 철저한 준비가 필요합니다. 하지만 이것은 극복해야 할 과제이지, 진로를 포기할 이유가 아닙니다.</w:t>
       </w:r>
     </w:p>
     <w:p>
@@ -435,7 +418,7 @@
           <w:color w:val="1E293A"/>
           <w:sz w:val="22"/>
         </w:rPr>
-        <w:t>미국 등 해외 임상 환경은 체계적인 프로토콜, 합리적인 처우, 그리고 다문화 의료 경험이라는 큰 매력이 있습니다. 국내 경력을 쌓은 뒤 더 넓은 무대로 나가는 확장 경로로 고려하고 있습니다. 하지만 전문 의료 영어와 NCLEX-RN 취득은 지금부터 준비하지 않으면 늦는 장기 과제입니다.</w:t>
+        <w:t>미국을 비롯한 해외 임상 환경은 체계적인 프로토콜, 합리적인 처우, 그리고 다문화 의료 경험이라는 큰 매력이 있습니다. 국내에서 응급실 경력을 탄탄히 쌓은 후, 더 넓은 무대로 나아가는 확장 경로로 진지하게 고려하고 있습니다. 다만 전문 의료 영어 구사력과 NCLEX-RN 취득이라는 높은 진입 장벽이 있어, 지금부터 차근차근 준비하지 않으면 나중에 선택지 자체가 닫힐 수 있는 장기 과제입니다.</w:t>
       </w:r>
     </w:p>
     <w:p>
@@ -465,7 +448,7 @@
           <w:color w:val="1E293A"/>
           <w:sz w:val="22"/>
         </w:rPr>
-        <w:t>교육기관에서 학생 건강을 관리하는 안정적인 진로입니다. 워라밸이 뛰어나지만, 교직 이수 기회 자체가 제한적이고 임용고시 경쟁이 매우 치열합니다.</w:t>
+        <w:t>교육기관에서 학생들의 건강을 관리하는 안정적인 진로입니다. 워라밸이 뛰어나다는 점이 매력이지만, 교직 이수 기회 자체가 소수로 제한되어 있고 임용고시 경쟁이 매우 치열하다는 현실적인 장벽이 있습니다.</w:t>
       </w:r>
     </w:p>
     <w:p>
@@ -482,7 +465,7 @@
           <w:color w:val="1E293A"/>
           <w:sz w:val="22"/>
         </w:rPr>
-        <w:t>저는 1학년인 지금, 하나로 확정하지 않겠습니다. 세 가지 후보를 유연하게 탐색하면서, 학년마다 쌓이는 실습 경험과 역량을 기준으로 방향을 좁혀 나가겠습니다.</w:t>
+        <w:t>저는 1학년인 지금, 하나로 성급하게 확정하지 않겠습니다. 세 가지 후보를 유연하게 탐색하면서, 학년마다 쌓이는 실습 경험과 역량을 기준으로 방향을 점차 좁혀 나가겠습니다. 유연함이 흔들림이 아니라 전략입니다.</w:t>
       </w:r>
     </w:p>
     <w:p/>
@@ -508,7 +491,7 @@
           <w:color w:val="1E293A"/>
           <w:sz w:val="22"/>
         </w:rPr>
-        <w:t>진로 방향을 설정했다면, 지금 당장 무엇을 해야 하는지가 중요합니다. 1학년 한 해의 SMART 목표를 학업·진로·대인역량·경험·외국어·건강, 총 6개 영역으로 나눠 설계했습니다.</w:t>
+        <w:t>진로 방향을 설정했다면, 지금 당장 무엇을 해야 하는지가 중요합니다. 1학년 한 해의 SMART 목표를 학업·진로·대인역량·경험·외국어·건강, 총 6개 영역으로 나눠 구체적으로 설계했습니다.</w:t>
       </w:r>
     </w:p>
     <w:p>
@@ -538,7 +521,7 @@
           <w:color w:val="1E293A"/>
           <w:sz w:val="22"/>
         </w:rPr>
-        <w:t>1학기 인간 심리의 이해 과목에서 A 이상을 목표로 합니다. 이를 위해 매주 일요일 저녁 2시간, 그 주에 배운 핵심 전공 내용을 복습하는 루틴을 12월까지 유지하겠습니다. 간호학은 기초가 흔들리면 임상 실습에서 반드시 무너집니다. 지금의 복습 루틴이 3학년 실습의 토대가 됩니다.</w:t>
+        <w:t>1학기 인간 심리의 이해 과목에서 A 이상을 목표로 합니다. 이를 위해 매주 일요일 저녁 2시간, 그 주에 배운 핵심 전공 내용을 복습하는 루틴을 12월까지 빠짐없이 유지하겠습니다. 간호학은 기초가 흔들리면 임상 실습에서 반드시 무너집니다. 지금 1학년의 복습 루틴이 3학년 실습의 든든한 토대가 됩니다.</w:t>
       </w:r>
     </w:p>
     <w:p>
@@ -568,7 +551,7 @@
           <w:color w:val="1E293A"/>
           <w:sz w:val="22"/>
         </w:rPr>
-        <w:t>5월까지 학과 진로상담을 최소 1회 완료합니다. 그리고 여름방학 중 응급실 현직 간호사 인터뷰 또는 병원 견학을 한 차례 이상 직접 추진하겠습니다. 교과서와 실제 현장 사이의 간극을 1학년 때 눈으로 확인하는 것, 이게 제가 이 목표를 세운 이유입니다.</w:t>
+        <w:t>5월까지 학과 진로상담을 최소 1회 완료합니다. 교수님과의 면담을 통해 제 목표가 현실적인지, 제가 모르는 진로 경로는 없는지를 직접 확인하겠습니다. 그리고 여름방학 중에는 응급실 현직 간호사 인터뷰 또는 병원 견학을 한 차례 이상 직접 추진하겠습니다. 교과서와 실제 현장 사이의 간극을 1학년 때부터 눈으로 확인하는 것이 이 목표를 세운 이유입니다.</w:t>
       </w:r>
     </w:p>
     <w:p>
@@ -598,7 +581,7 @@
           <w:color w:val="1E293A"/>
           <w:sz w:val="22"/>
         </w:rPr>
-        <w:t>전공 스터디 그룹에 적극 참여하고, 가능하다면 직접 이끌겠습니다. 응급 현장에서 간호사는 절대 혼자 움직이지 않습니다. 팀워크와 커뮤니케이션은 지금 학교에서부터 쌓아야 합니다.</w:t>
+        <w:t>전공 스터디 그룹에 적극 참여하고, 가능하다면 직접 이끌겠습니다. 응급 현장에서 간호사는 절대 혼자 움직이지 않습니다. 의사, 타 간호사, 응급구조사와의 팀워크가 환자의 생명을 좌우합니다. 그 협업 능력의 기초를 지금 학교에서 쌓겠습니다.</w:t>
       </w:r>
     </w:p>
     <w:p>
@@ -628,7 +611,7 @@
           <w:color w:val="1E293A"/>
           <w:sz w:val="22"/>
         </w:rPr>
-        <w:t>여름방학 기간, 지역 보건·의료기관 연계 봉사활동 30시간을 공식 일지와 함께 수료합니다. 실제 환자 곁에 서는 경험은 어떤 수업보다 강렬한 공부입니다.</w:t>
+        <w:t>여름방학 기간, 지역 보건·의료기관 연계 봉사활동 30시간을 공식 일지와 함께 수료합니다. 실제 환자 곁에서 직접 보고 느끼는 경험은 어떤 교과서보다 강렬하고 오래 남는 공부입니다.</w:t>
       </w:r>
     </w:p>
     <w:p>
@@ -658,7 +641,7 @@
           <w:color w:val="1E293A"/>
           <w:sz w:val="22"/>
         </w:rPr>
-        <w:t>12월까지 토익 700점 이상을 취득하고, 매일 영문 의학용어 5개를 암기합니다. USRN의 가능성을 열어 두기 위한 최소한의 준비이자, 3학년 이후 해외 논문 독해를 위한 사전 투자입니다.</w:t>
+        <w:t>12월까지 토익 700점 이상을 취득하고, 매일 영문 의학용어 5개를 꾸준히 암기합니다. USRN의 가능성을 열어 두기 위한 최소한의 준비이자, 3학년 이후 해외 의학 논문을 직접 읽기 위한 사전 투자입니다.</w:t>
       </w:r>
     </w:p>
     <w:p>
@@ -688,7 +671,7 @@
           <w:color w:val="1E293A"/>
           <w:sz w:val="22"/>
         </w:rPr>
-        <w:t>주 3회 30분 이상 유산소 운동, 매일 6시간 이상 수면을 지킵니다. 3교대 근무의 강도를 버텨낼 체력은 지금부터 저축해야 합니다. 건강 관리는 선택이 아니라 미래 직업을 위한 필수 준비입니다.</w:t>
+        <w:t>주 3회 30분 이상 유산소 운동, 매일 6시간 이상 수면을 반드시 지킵니다. 응급실 3교대 근무의 강도를 버텨낼 체력은 지금부터 쌓아야 합니다. 체력 관리는 미래의 직업을 위한 가장 기초적인 준비입니다.</w:t>
       </w:r>
     </w:p>
     <w:p/>
@@ -714,7 +697,7 @@
           <w:color w:val="1E293A"/>
           <w:sz w:val="22"/>
         </w:rPr>
-        <w:t>1학년의 기초 위에 2학년부터 4학년까지의 중기 로드맵을 설계했습니다. 각 학년마다 반드시 달성해야 할 핵심 과업을 세 가지 영역으로 나눴습니다.</w:t>
+        <w:t>1학년의 기초 위에 2학년부터 4학년까지의 중기 로드맵을 설계했습니다. 각 학년마다 반드시 달성해야 할 핵심 과업을 학업·진로·경험 세 가지 축으로 나눴습니다.</w:t>
       </w:r>
     </w:p>
     <w:p>
@@ -744,7 +727,7 @@
           <w:color w:val="1E293A"/>
           <w:sz w:val="22"/>
         </w:rPr>
-        <w:t>학업 측면에서는 병태생리학, 약리학, 건강사정 등 임상 간호의 핵심 과목들을 충실히 이수합니다. 이 시기의 전공 성적이 3학년 실습 배치에 직접 영향을 줍니다. 진로 측면에서는 교직 이수 신청 여부를 이 시기에 최종 결정합니다. 보건교사를 선택한다면 더 이상 미룰 수 없는 시점입니다. 역량 측면에서는 토익 800점 이상을 달성하고, 응급실 선배 간호사와의 심층 인터뷰를 통해 현장 요구 역량을 구체적으로 파악하겠습니다.</w:t>
+        <w:t>학업 측면에서는 병태생리학, 약리학, 건강사정 등 임상 간호의 핵심 과목들을 충실히 이수합니다. 이 시기의 전공 성적과 학업 태도가 3학년 실습 배치에 직접적인 영향을 줍니다. 진로 측면에서는 교직 이수 신청 여부를 이 시기에 최종 결정해야 합니다. 보건교사 진로를 선택한다면 2학년이 그 마지막 시점입니다. 역량 측면에서는 토익 800점 이상 달성을 목표로 하고, 응급실 선배 간호사와의 심층 인터뷰를 통해 현장에서 실제로 요구되는 역량이 무엇인지를 직접 파악하겠습니다.</w:t>
       </w:r>
     </w:p>
     <w:p>
@@ -774,7 +757,7 @@
           <w:color w:val="1E293A"/>
           <w:sz w:val="22"/>
         </w:rPr>
-        <w:t>이 시기가 로드맵의 핵심입니다. 병원 실습이 시작되며, 저는 응급실과 수술실 실습에 적극적으로 집중 배치를 요청할 것입니다. 실습 현장에서 단순한 관찰자가 아닌, 질문하고 기록하고 배우는 능동적인 자세를 유지하겠습니다. 해외 진출 가능성을 위해 NCLEX-RN 준비 자료 수집도 이 시기에 시작합니다. 학술대회 포스터 발표에도 도전해볼 계획입니다.</w:t>
+        <w:t>이 시기가 로드맵 전체의 핵심입니다. 드디어 병원 임상 실습이 시작됩니다. 저는 응급실과 수술실 실습에 적극적으로 집중 배치를 요청할 것입니다. 실습 현장에서 단순한 관찰자에 머물지 않겠습니다. 처치 하나하나에 담긴 이유를 이해하고, 현직 간호사들에게 적극적으로 질문하며 배우는 자세를 유지하겠습니다. 해외 진출 가능성을 위해 NCLEX-RN 준비 자료 수집도 이 시기에 시작합니다. 학술대회 포스터 발표 참가에도 도전해볼 계획입니다.</w:t>
       </w:r>
     </w:p>
     <w:p>
@@ -804,7 +787,7 @@
           <w:color w:val="1E293A"/>
           <w:sz w:val="22"/>
         </w:rPr>
-        <w:t>모든 에너지를 간호사 국가고시 합격과 종합병원 공개 채용 준비에 집중합니다. 응급실 맞춤형 자기소개서를 완성하고, 교내외 모의면접 프로그램을 통해 실전 감각을 키웁니다. 해외 진출을 선택했다면 이 시기에 NCLEX 모의문제 풀이를 본격 시작합니다.</w:t>
+        <w:t>모든 에너지를 간호사 국가고시 합격과 종합병원 공개 채용 준비에 집중합니다. 응급실 취업을 목표로 한 맞춤형 자기소개서를 완성하고, 교내외 모의면접 프로그램에 적극 참여해 실전 감각을 키웁니다. 해외 진출을 선택했다면 이 시기에 NCLEX 모의문제 풀이를 본격적으로 시작합니다.</w:t>
       </w:r>
     </w:p>
     <w:p>
@@ -821,7 +804,7 @@
           <w:color w:val="1E293A"/>
           <w:sz w:val="22"/>
         </w:rPr>
-        <w:t>이 로드맵은 고정된 계획이 아닙니다. 매 학년 말 반드시 점검하고, 실제 경험과 상황에 따라 능동적으로 수정해 나가겠습니다.</w:t>
+        <w:t>이 로드맵은 고정된 계획이 아닙니다. 매 학년 말 반드시 점검하고, 실제 경험과 상황에 따라 능동적으로 수정해 나갈 것입니다. 바다의 흐름에 맞춰 항로를 조정하는 것, 그것이 현명한 항해입니다.</w:t>
       </w:r>
     </w:p>
     <w:p/>
@@ -864,7 +847,7 @@
           <w:color w:val="1E293A"/>
           <w:sz w:val="22"/>
         </w:rPr>
-        <w:t>저의 목표는 종합병원 응급실의 3년차 간호사입니다. 단순히 취업에 성공한 것이 아니라, 응급 환경에서 실력으로 신뢰를 얻은 전문가로 자리 잡은 모습입니다.</w:t>
+        <w:t>저의 목표는 종합병원 응급실의 3년차 간호사입니다. 단순히 취업에 성공한 것이 아니라, 응급 환경에서 실력으로 신뢰를 얻고 팀의 중심이 된 전문가로 자리 잡은 모습입니다.</w:t>
       </w:r>
     </w:p>
     <w:p>
@@ -881,7 +864,7 @@
           <w:color w:val="1E293A"/>
           <w:sz w:val="22"/>
         </w:rPr>
-        <w:t>신속한 의사결정, 흔들리지 않는 책임감, 그리고 의료진과의 유기적인 협업으로 환자의 골든타임을 매번 지켜내는 간호사. 어떤 상황에서도 당황하지 않고 프로토콜에 따라 정확하게 움직이는 사람. 그것이 5년 후 제가 목표로 하는 모습입니다.</w:t>
+        <w:t>신속한 의사결정, 흔들리지 않는 책임감, 그리고 의료진과의 유기적인 협업으로 환자의 골든타임을 매번 지켜내는 간호사. 어떤 상황에서도 침착하게 프로토콜에 따라 정확하게 움직이는 사람. 어떤 중증 환자가 들어와도 "이 간호사라면 믿을 수 있다"는 신뢰를 받는 사람. 그것이 5년 후 제가 목표로 하는 모습입니다.</w:t>
       </w:r>
     </w:p>
     <w:p>
@@ -898,7 +881,7 @@
           <w:color w:val="1E293A"/>
           <w:sz w:val="22"/>
         </w:rPr>
-        <w:t>임상 역량 측면에서는, 중증 응급 환자 간호 경험을 꾸준히 쌓으면서 정기 학술대회 참가를 통해 최신 응급의학 동향을 놓치지 않겠습니다. 그리고 3년차가 되면 신입 간호사들을 교육하는 역할도 맡고 싶습니다. 제가 받은 가르침을 다음 세대에게 돌려주는 것, 그것 또한 제가 원하는 사회적 기여의 한 형태입니다.</w:t>
+        <w:t>임상 역량 측면에서는, 중증 응급 환자 간호 경험을 꾸준히 쌓으면서 정기 학술대회 참가를 통해 최신 응급의학 동향을 놓치지 않겠습니다. 그리고 3년차가 되면 신입 간호사들을 교육하고 온보딩을 이끄는 리더 역할도 맡고 싶습니다. 제가 힘들게 배운 것들을 다음 세대에게 돌려주는 것, 그것 역시 제가 원하는 사회적 기여의 한 형태입니다.</w:t>
       </w:r>
     </w:p>
     <w:p>
@@ -915,7 +898,7 @@
           <w:color w:val="1E293A"/>
           <w:sz w:val="22"/>
         </w:rPr>
-        <w:t>동시에 글로벌 트랙의 가능성도 열어 둡니다. 국내 응급실에서 쌓은 탄탄한 임상 경력을 바탕으로 NCLEX-RN을 취득해, 미국을 비롯한 해외 의료 현장에서 환자를 돌보는 미래도 진지하게 그리고 있습니다.</w:t>
+        <w:t>동시에 글로벌 트랙의 가능성도 열어 둡니다. 국내 응급실에서 쌓은 탄탄한 임상 경력을 바탕으로 NCLEX-RN을 취득해, 미국을 비롯한 해외 의료 현장에서 더 다양한 환자들을 돌보는 미래도 진지하게 그리고 있습니다. 국내 트랙이든 글로벌 트랙이든, 두 방향 모두 지금의 준비를 토대로 가능한 미래입니다.</w:t>
       </w:r>
     </w:p>
     <w:p>
@@ -932,7 +915,7 @@
           <w:color w:val="1E293A"/>
           <w:sz w:val="22"/>
         </w:rPr>
-        <w:t>5년 후의 저는, 어느 트랙을 선택했든 자신의 선택을 후회하지 않을 만큼 충분히 준비한 사람이어야 합니다. 그 준비를 오늘 시작합니다.</w:t>
+        <w:t>5년 후의 저는, 어느 길을 선택했든 자신의 선택을 후회하지 않을 만큼 충분히 준비한 사람이어야 합니다. 그 준비는 오늘부터 시작됩니다.</w:t>
       </w:r>
     </w:p>
     <w:p/>
@@ -958,7 +941,7 @@
           <w:color w:val="1E293A"/>
           <w:sz w:val="22"/>
         </w:rPr>
-        <w:t>지금까지 발표한 모든 계획은 실천이 뒤따르지 않으면 아무 의미가 없습니다. 이번 슬라이드는 그 실천의 시작입니다.</w:t>
+        <w:t>지금까지 발표한 모든 계획은 실천이 뒤따르지 않으면 아무 의미가 없습니다. 이번 슬라이드는 화려한 미래 계획이 아니라, 오늘 이 자리에서 제 자신과 맺는 서약입니다.</w:t>
       </w:r>
     </w:p>
     <w:p>
@@ -975,7 +958,7 @@
           <w:color w:val="1E293A"/>
           <w:sz w:val="22"/>
         </w:rPr>
-        <w:t>저는 이번 학기 안에 반드시 두 가지를 실행하겠습니다. '하겠다'가 아닌, 저 자신과의 서약입니다.</w:t>
+        <w:t>저는 이번 학기 안에 반드시 두 가지를 실행하겠습니다.</w:t>
       </w:r>
     </w:p>
     <w:p>
@@ -1005,24 +988,7 @@
           <w:color w:val="1E293A"/>
           <w:sz w:val="22"/>
         </w:rPr>
-        <w:t>1365 자원봉사 포털 또는 학교 연계 지역 의료기관 사이트를 통해 여름방학 봉사 일정을 이번 달 안에 직접 잡겠습니다. "방학이 되면 신청하지"가 아닙니다. 지금 당장 경로를 확인하고, 이번 달 안에 신청을 완료합니다.</w:t>
-      </w:r>
-    </w:p>
-    <w:p>
-      <w:pPr>
-        <w:spacing w:after="160"/>
-      </w:pPr>
-    </w:p>
-    <w:p>
-      <w:pPr>
-        <w:spacing w:after="80"/>
-      </w:pPr>
-      <w:r>
-        <w:rPr>
-          <w:color w:val="1E293A"/>
-          <w:sz w:val="22"/>
-        </w:rPr>
-        <w:t>구체적인 실행 전술은 다음과 같습니다. 이번 주 안에 1365 포털에 로그인해 원주 지역 의료 봉사 목록을 검색합니다. 가능한 일정 세 가지를 추려 이번 달 안에 신청 버튼을 누릅니다.</w:t>
+        <w:t>1365 자원봉사 포털 또는 학교 연계 지역 의료기관 사이트를 통해 여름방학 봉사 일정을 이번 달 안에 직접 잡겠습니다. "방학이 되면 신청하지"가 아닙니다. 이번 주 안에 1365 포털에 접속해 원주 지역 의료 봉사 목록을 검색하고, 가능한 일정 세 가지를 추린 뒤 이번 달 안에 신청을 완료합니다. 구체적인 날짜와 기관 이름이 정해져야 진짜 실행이 시작됩니다.</w:t>
       </w:r>
     </w:p>
     <w:p>
@@ -1052,7 +1018,7 @@
           <w:color w:val="1E293A"/>
           <w:sz w:val="22"/>
         </w:rPr>
-        <w:t>장소는 교내 도서관 또는 집 서재. 시간은 일요일 저녁 8시. 시작 전 휴대폰 알림을 전면 차단합니다. 2시간 동안 그 주에 배운 전공 핵심 내용을 정리합니다. 끝나면 플래너에 체크 마크를 남깁니다. 학기 말에 그 체크 마크의 줄을 스스로 세어봅니다.</w:t>
+        <w:t>장소는 교내 도서관 또는 집 서재. 시간은 일요일 저녁 8시부터 10시까지. 시작 전 휴대폰 알림을 전면 차단합니다. 2시간 동안 그 주에 배운 전공 핵심 내용을 교재를 보며 정리합니다. 끝나면 플래너에 체크 마크를 남깁니다. 학기 말에 그 체크 마크의 줄을 스스로 세어볼 것입니다. 체크 마크의 수가 곧 제 성실함의 증거가 됩니다.</w:t>
       </w:r>
     </w:p>
     <w:p>
@@ -1069,7 +1035,7 @@
           <w:color w:val="1E293A"/>
           <w:sz w:val="22"/>
         </w:rPr>
-        <w:t>이 두 가지가 작아 보일 수 있습니다. 하지만 저는 이것이 응급실 간호사를 향한 가장 정직한 첫걸음이라고 확신합니다.</w:t>
+        <w:t>이 두 가지가 소박하고 작아 보일 수 있습니다. 그러나 저는 이 두 가지를 학기 말까지 흔들림 없이 지켜내는 것이 응급실 간호사를 향한 가장 정직하고 진지한 첫걸음이라고 확신합니다.</w:t>
       </w:r>
     </w:p>
     <w:p>
@@ -1086,7 +1052,7 @@
           <w:color w:val="1E293A"/>
           <w:sz w:val="22"/>
         </w:rPr>
-        <w:t>생각에서 실천으로, 실천에서 인생으로.</w:t>
+        <w:t>생각에서 실천으로, 실천에서 인생으로. 오늘 이 서약이 그 시작입니다.</w:t>
       </w:r>
     </w:p>
     <w:p/>
@@ -1146,7 +1112,7 @@
           <w:color w:val="1E293A"/>
           <w:sz w:val="22"/>
         </w:rPr>
-        <w:t>솔직히 말씀드리면, 오늘 이 발표를 준비하면서 확신이 섰던 순간과 흔들렸던 순간이 반반이었습니다. '과연 내가 응급실의 강도를 버텨낼 수 있을까', '4년 안에 이 모든 걸 다 해낼 수 있을까'라는 의문도 들었습니다.</w:t>
+        <w:t>솔직히 말씀드리면, 이 발표를 준비하면서 확신이 섰던 순간과 흔들렸던 순간이 반반이었습니다. '과연 내가 응급실의 강도를 버텨낼 수 있을까', '4년 안에 이 모든 것을 정말 해낼 수 있을까'라는 의문도 들었습니다. 계획을 세우면 세울수록 현실의 무게가 느껴졌습니다.</w:t>
       </w:r>
     </w:p>
     <w:p>
@@ -1163,7 +1129,7 @@
           <w:color w:val="1E293A"/>
           <w:sz w:val="22"/>
         </w:rPr>
-        <w:t>하지만 동시에 알게 됐습니다. 지금 제가 세운 계획이 4년 뒤에도 그대로일 거라고 생각하지 않는다는 것을. 실습을 하며 생각이 바뀔 수도 있고, 예상치 못한 기회가 찾아올 수도 있습니다. 그래도 괜찮습니다.</w:t>
+        <w:t>하지만 동시에 중요한 것을 깨달았습니다. 지금 제가 세운 계획이 4년 뒤에도 그대로일 거라고 생각하지 않는다는 것을요. 임상 실습을 하며 생각이 바뀔 수도 있고, 예상치 못한 기회가 찾아올 수도 있습니다. 그래도 괜찮습니다. 중요한 건 그게 아닙니다.</w:t>
       </w:r>
     </w:p>
     <w:p>
@@ -1180,7 +1146,7 @@
           <w:color w:val="1E293A"/>
           <w:sz w:val="22"/>
         </w:rPr>
-        <w:t>중요한 건, 지금 이 순간 내가 어디로 가고 싶은지 알고 있다는 것. 그리고 그 방향을 향해 오늘 이 자리에서 공개적으로 선언했다는 것입니다.</w:t>
+        <w:t>중요한 건, 지금 이 순간 내가 어디로 가고 싶은지 알고 있다는 것입니다. 그리고 그 방향을 향해 오늘 이 자리에서 공개적으로 선언했다는 것입니다. 선언은 책임을 만들고, 책임은 실천을 만듭니다.</w:t>
       </w:r>
     </w:p>
     <w:p>
@@ -1197,7 +1163,7 @@
           <w:color w:val="1E293A"/>
           <w:sz w:val="22"/>
         </w:rPr>
-        <w:t>강원대학교 간호학과에 입학한 것이 저의 첫 번째 용기 있는 선택이었다면, 오늘 이 발표는 저의 두 번째 출발점이 됩니다.</w:t>
+        <w:t>강원대학교 간호학과에 입학한 것이 저의 첫 번째 용기 있는 선택이었다면, 오늘 이 발표는 저의 두 번째 출발점입니다.</w:t>
       </w:r>
     </w:p>
     <w:p>

</xml_diff>